<commit_message>
docs: add terminal mockup screenshot to standalone docx report
</commit_message>
<xml_diff>
--- a/Lampiran_E_Performance_Testing.docx
+++ b/Lampiran_E_Performance_Testing.docx
@@ -127,7 +127,77 @@
           <w:rFonts w:ascii="Times New Roman" w:hAnsi="Times New Roman"/>
           <w:rFonts w:ascii="Times New Roman" w:hAnsi="Times New Roman" w:cs="Times New Roman" w:eastAsia="Times New Roman"/>
         </w:rPr>
-        <w:t>2. Grafik Hasil Pengujian (Performance Metrics Chart)</w:t>
+        <w:t>2. Screenshot Penggunaan Tools</w:t>
+      </w:r>
+    </w:p>
+    <w:p>
+      <w:pPr>
+        <w:spacing w:line="276" w:lineRule="auto"/>
+      </w:pPr>
+      <w:r>
+        <w:rPr>
+          <w:rFonts w:ascii="Times New Roman" w:hAnsi="Times New Roman"/>
+          <w:rFonts w:ascii="Times New Roman" w:hAnsi="Times New Roman" w:cs="Times New Roman" w:eastAsia="Times New Roman"/>
+          <w:sz w:val="24"/>
+        </w:rPr>
+        <w:t>Berikut adalah tangkapan layar pengeksekusian skrip pengujian beban asinkron Node.js Autocannon menggunakan terminal Windows PowerShell untuk skenario beban 50, 200, dan 500 koneksi simultan:</w:t>
+      </w:r>
+    </w:p>
+    <w:p>
+      <w:pPr>
+        <w:spacing w:line="276" w:lineRule="auto"/>
+      </w:pPr>
+      <w:r>
+        <w:rPr>
+          <w:rFonts w:ascii="Times New Roman" w:hAnsi="Times New Roman"/>
+          <w:rFonts w:ascii="Times New Roman" w:hAnsi="Times New Roman" w:cs="Times New Roman" w:eastAsia="Times New Roman"/>
+          <w:sz w:val="24"/>
+        </w:rPr>
+        <w:drawing>
+          <wp:inline xmlns:a="http://schemas.openxmlformats.org/drawingml/2006/main" xmlns:pic="http://schemas.openxmlformats.org/drawingml/2006/picture">
+            <wp:extent cx="5486400" cy="3098202"/>
+            <wp:docPr id="1" name="Picture 1"/>
+            <wp:cNvGraphicFramePr>
+              <a:graphicFrameLocks noChangeAspect="1"/>
+            </wp:cNvGraphicFramePr>
+            <a:graphic>
+              <a:graphicData uri="http://schemas.openxmlformats.org/drawingml/2006/picture">
+                <pic:pic>
+                  <pic:nvPicPr>
+                    <pic:cNvPr id="0" name="tool_usage_terminal.png"/>
+                    <pic:cNvPicPr/>
+                  </pic:nvPicPr>
+                  <pic:blipFill>
+                    <a:blip r:embed="rId9"/>
+                    <a:stretch>
+                      <a:fillRect/>
+                    </a:stretch>
+                  </pic:blipFill>
+                  <pic:spPr>
+                    <a:xfrm>
+                      <a:off x="0" y="0"/>
+                      <a:ext cx="5486400" cy="3098202"/>
+                    </a:xfrm>
+                    <a:prstGeom prst="rect"/>
+                  </pic:spPr>
+                </pic:pic>
+              </a:graphicData>
+            </a:graphic>
+          </wp:inline>
+        </w:drawing>
+      </w:r>
+    </w:p>
+    <w:p>
+      <w:pPr>
+        <w:pStyle w:val="Heading2"/>
+        <w:spacing w:line="276" w:lineRule="auto"/>
+      </w:pPr>
+      <w:r>
+        <w:rPr>
+          <w:rFonts w:ascii="Times New Roman" w:hAnsi="Times New Roman"/>
+          <w:rFonts w:ascii="Times New Roman" w:hAnsi="Times New Roman" w:cs="Times New Roman" w:eastAsia="Times New Roman"/>
+        </w:rPr>
+        <w:t>3. Grafik Hasil Pengujian (Performance Metrics Chart)</w:t>
       </w:r>
     </w:p>
     <w:p>
@@ -156,7 +226,7 @@
         <w:drawing>
           <wp:inline xmlns:a="http://schemas.openxmlformats.org/drawingml/2006/main" xmlns:pic="http://schemas.openxmlformats.org/drawingml/2006/picture">
             <wp:extent cx="5486400" cy="3291840"/>
-            <wp:docPr id="1" name="Picture 1"/>
+            <wp:docPr id="2" name="Picture 2"/>
             <wp:cNvGraphicFramePr>
               <a:graphicFrameLocks noChangeAspect="1"/>
             </wp:cNvGraphicFramePr>
@@ -168,7 +238,7 @@
                     <pic:cNvPicPr/>
                   </pic:nvPicPr>
                   <pic:blipFill>
-                    <a:blip r:embed="rId9"/>
+                    <a:blip r:embed="rId10"/>
                     <a:stretch>
                       <a:fillRect/>
                     </a:stretch>
@@ -197,7 +267,7 @@
           <w:rFonts w:ascii="Times New Roman" w:hAnsi="Times New Roman"/>
           <w:rFonts w:ascii="Times New Roman" w:hAnsi="Times New Roman" w:cs="Times New Roman" w:eastAsia="Times New Roman"/>
         </w:rPr>
-        <w:t>3. Tabel Hasil Data Kinerja</w:t>
+        <w:t>4. Tabel Hasil Data Kinerja</w:t>
       </w:r>
     </w:p>
     <w:p>
@@ -769,7 +839,7 @@
           <w:rFonts w:ascii="Times New Roman" w:hAnsi="Times New Roman"/>
           <w:rFonts w:ascii="Times New Roman" w:hAnsi="Times New Roman" w:cs="Times New Roman" w:eastAsia="Times New Roman"/>
         </w:rPr>
-        <w:t>4. Analisis Hasil Pengujian</w:t>
+        <w:t>5. Analisis Hasil Pengujian</w:t>
       </w:r>
     </w:p>
     <w:p>

</xml_diff>